<commit_message>
Remove client acquisition service, fix resume formatting
</commit_message>
<xml_diff>
--- a/Sandra-A-Luna-Resume.docx
+++ b/Sandra-A-Luna-Resume.docx
@@ -427,6 +427,7 @@
     </w:p>
     <w:p>
       <w:pPr>
+        <w:keepNext/>
         <w:tabs>
           <w:tab w:val="right" w:pos="9026"/>
         </w:tabs>
@@ -457,6 +458,7 @@
     </w:p>
     <w:p>
       <w:pPr>
+        <w:keepNext/>
         <w:spacing w:after="60"/>
       </w:pPr>
       <w:r>
@@ -568,6 +570,7 @@
     </w:p>
     <w:p>
       <w:pPr>
+        <w:keepNext/>
         <w:tabs>
           <w:tab w:val="right" w:pos="9026"/>
         </w:tabs>
@@ -598,6 +601,7 @@
     </w:p>
     <w:p>
       <w:pPr>
+        <w:keepNext/>
         <w:spacing w:after="60"/>
       </w:pPr>
       <w:r>
@@ -671,6 +675,7 @@
     </w:p>
     <w:p>
       <w:pPr>
+        <w:keepNext/>
         <w:tabs>
           <w:tab w:val="right" w:pos="9026"/>
         </w:tabs>
@@ -701,6 +706,7 @@
     </w:p>
     <w:p>
       <w:pPr>
+        <w:keepNext/>
         <w:spacing w:after="60"/>
       </w:pPr>
       <w:r>
@@ -812,6 +818,7 @@
     </w:p>
     <w:p>
       <w:pPr>
+        <w:keepNext/>
         <w:tabs>
           <w:tab w:val="right" w:pos="9026"/>
         </w:tabs>
@@ -842,6 +849,7 @@
     </w:p>
     <w:p>
       <w:pPr>
+        <w:keepNext/>
         <w:spacing w:after="60"/>
       </w:pPr>
       <w:r>
@@ -953,6 +961,7 @@
     </w:p>
     <w:p>
       <w:pPr>
+        <w:keepNext/>
         <w:tabs>
           <w:tab w:val="right" w:pos="9026"/>
         </w:tabs>
@@ -983,6 +992,7 @@
     </w:p>
     <w:p>
       <w:pPr>
+        <w:keepNext/>
         <w:spacing w:after="60"/>
       </w:pPr>
       <w:r>
@@ -1094,6 +1104,7 @@
     </w:p>
     <w:p>
       <w:pPr>
+        <w:keepNext/>
         <w:tabs>
           <w:tab w:val="right" w:pos="9026"/>
         </w:tabs>
@@ -1124,6 +1135,7 @@
     </w:p>
     <w:p>
       <w:pPr>
+        <w:keepNext/>
         <w:spacing w:after="60"/>
       </w:pPr>
       <w:r>
@@ -1719,7 +1731,7 @@
                 <w:rFonts w:ascii="Arial" w:cs="Arial" w:eastAsia="Arial" w:hAnsi="Arial"/>
                 <w:i/>
                 <w:iCs/>
-                <w:color w:val="555555"/>
+                <w:color w:val="2d6a4f"/>
                 <w:sz w:val="20"/>
                 <w:szCs w:val="20"/>
               </w:rPr>

</xml_diff>

<commit_message>
Fix resume page break and cert formatting
</commit_message>
<xml_diff>
--- a/Sandra-A-Luna-Resume.docx
+++ b/Sandra-A-Luna-Resume.docx
@@ -476,6 +476,8 @@
     <w:p>
       <w:pPr>
         <w:pStyle w:val="ListParagraph"/>
+        <w:keepNext w:val="false"/>
+        <w:keepLines/>
         <w:numPr>
           <w:ilvl w:val="0"/>
           <w:numId w:val="3"/>
@@ -495,6 +497,8 @@
     <w:p>
       <w:pPr>
         <w:pStyle w:val="ListParagraph"/>
+        <w:keepNext w:val="false"/>
+        <w:keepLines/>
         <w:numPr>
           <w:ilvl w:val="0"/>
           <w:numId w:val="3"/>
@@ -514,6 +518,8 @@
     <w:p>
       <w:pPr>
         <w:pStyle w:val="ListParagraph"/>
+        <w:keepNext w:val="false"/>
+        <w:keepLines/>
         <w:numPr>
           <w:ilvl w:val="0"/>
           <w:numId w:val="3"/>
@@ -533,6 +539,8 @@
     <w:p>
       <w:pPr>
         <w:pStyle w:val="ListParagraph"/>
+        <w:keepNext w:val="false"/>
+        <w:keepLines/>
         <w:numPr>
           <w:ilvl w:val="0"/>
           <w:numId w:val="3"/>
@@ -552,6 +560,8 @@
     <w:p>
       <w:pPr>
         <w:pStyle w:val="ListParagraph"/>
+        <w:keepNext w:val="false"/>
+        <w:keepLines/>
         <w:numPr>
           <w:ilvl w:val="0"/>
           <w:numId w:val="3"/>
@@ -619,6 +629,8 @@
     <w:p>
       <w:pPr>
         <w:pStyle w:val="ListParagraph"/>
+        <w:keepNext w:val="false"/>
+        <w:keepLines/>
         <w:numPr>
           <w:ilvl w:val="0"/>
           <w:numId w:val="3"/>
@@ -638,6 +650,8 @@
     <w:p>
       <w:pPr>
         <w:pStyle w:val="ListParagraph"/>
+        <w:keepNext w:val="false"/>
+        <w:keepLines/>
         <w:numPr>
           <w:ilvl w:val="0"/>
           <w:numId w:val="3"/>
@@ -657,6 +671,8 @@
     <w:p>
       <w:pPr>
         <w:pStyle w:val="ListParagraph"/>
+        <w:keepNext w:val="false"/>
+        <w:keepLines/>
         <w:numPr>
           <w:ilvl w:val="0"/>
           <w:numId w:val="3"/>
@@ -724,6 +740,8 @@
     <w:p>
       <w:pPr>
         <w:pStyle w:val="ListParagraph"/>
+        <w:keepNext w:val="false"/>
+        <w:keepLines/>
         <w:numPr>
           <w:ilvl w:val="0"/>
           <w:numId w:val="3"/>
@@ -743,6 +761,8 @@
     <w:p>
       <w:pPr>
         <w:pStyle w:val="ListParagraph"/>
+        <w:keepNext w:val="false"/>
+        <w:keepLines/>
         <w:numPr>
           <w:ilvl w:val="0"/>
           <w:numId w:val="3"/>
@@ -762,6 +782,8 @@
     <w:p>
       <w:pPr>
         <w:pStyle w:val="ListParagraph"/>
+        <w:keepNext w:val="false"/>
+        <w:keepLines/>
         <w:numPr>
           <w:ilvl w:val="0"/>
           <w:numId w:val="3"/>
@@ -781,6 +803,8 @@
     <w:p>
       <w:pPr>
         <w:pStyle w:val="ListParagraph"/>
+        <w:keepNext w:val="false"/>
+        <w:keepLines/>
         <w:numPr>
           <w:ilvl w:val="0"/>
           <w:numId w:val="3"/>
@@ -800,6 +824,8 @@
     <w:p>
       <w:pPr>
         <w:pStyle w:val="ListParagraph"/>
+        <w:keepNext w:val="false"/>
+        <w:keepLines/>
         <w:numPr>
           <w:ilvl w:val="0"/>
           <w:numId w:val="3"/>
@@ -815,6 +841,12 @@
         </w:rPr>
         <w:t xml:space="preserve">Prepared regular reports for stakeholders to aid in budgetary decision-making</w:t>
       </w:r>
+    </w:p>
+    <w:p>
+      <w:pPr>
+        <w:pageBreakBefore/>
+        <w:spacing w:after="0"/>
+      </w:pPr>
     </w:p>
     <w:p>
       <w:pPr>
@@ -867,6 +899,8 @@
     <w:p>
       <w:pPr>
         <w:pStyle w:val="ListParagraph"/>
+        <w:keepNext w:val="false"/>
+        <w:keepLines/>
         <w:numPr>
           <w:ilvl w:val="0"/>
           <w:numId w:val="3"/>
@@ -886,6 +920,8 @@
     <w:p>
       <w:pPr>
         <w:pStyle w:val="ListParagraph"/>
+        <w:keepNext w:val="false"/>
+        <w:keepLines/>
         <w:numPr>
           <w:ilvl w:val="0"/>
           <w:numId w:val="3"/>
@@ -905,6 +941,8 @@
     <w:p>
       <w:pPr>
         <w:pStyle w:val="ListParagraph"/>
+        <w:keepNext w:val="false"/>
+        <w:keepLines/>
         <w:numPr>
           <w:ilvl w:val="0"/>
           <w:numId w:val="3"/>
@@ -924,6 +962,8 @@
     <w:p>
       <w:pPr>
         <w:pStyle w:val="ListParagraph"/>
+        <w:keepNext w:val="false"/>
+        <w:keepLines/>
         <w:numPr>
           <w:ilvl w:val="0"/>
           <w:numId w:val="3"/>
@@ -943,6 +983,8 @@
     <w:p>
       <w:pPr>
         <w:pStyle w:val="ListParagraph"/>
+        <w:keepNext w:val="false"/>
+        <w:keepLines/>
         <w:numPr>
           <w:ilvl w:val="0"/>
           <w:numId w:val="3"/>
@@ -1010,6 +1052,8 @@
     <w:p>
       <w:pPr>
         <w:pStyle w:val="ListParagraph"/>
+        <w:keepNext w:val="false"/>
+        <w:keepLines/>
         <w:numPr>
           <w:ilvl w:val="0"/>
           <w:numId w:val="3"/>
@@ -1029,6 +1073,8 @@
     <w:p>
       <w:pPr>
         <w:pStyle w:val="ListParagraph"/>
+        <w:keepNext w:val="false"/>
+        <w:keepLines/>
         <w:numPr>
           <w:ilvl w:val="0"/>
           <w:numId w:val="3"/>
@@ -1048,6 +1094,8 @@
     <w:p>
       <w:pPr>
         <w:pStyle w:val="ListParagraph"/>
+        <w:keepNext w:val="false"/>
+        <w:keepLines/>
         <w:numPr>
           <w:ilvl w:val="0"/>
           <w:numId w:val="3"/>
@@ -1067,6 +1115,8 @@
     <w:p>
       <w:pPr>
         <w:pStyle w:val="ListParagraph"/>
+        <w:keepNext w:val="false"/>
+        <w:keepLines/>
         <w:numPr>
           <w:ilvl w:val="0"/>
           <w:numId w:val="3"/>
@@ -1086,6 +1136,8 @@
     <w:p>
       <w:pPr>
         <w:pStyle w:val="ListParagraph"/>
+        <w:keepNext w:val="false"/>
+        <w:keepLines/>
         <w:numPr>
           <w:ilvl w:val="0"/>
           <w:numId w:val="3"/>
@@ -1153,6 +1205,8 @@
     <w:p>
       <w:pPr>
         <w:pStyle w:val="ListParagraph"/>
+        <w:keepNext w:val="false"/>
+        <w:keepLines/>
         <w:numPr>
           <w:ilvl w:val="0"/>
           <w:numId w:val="3"/>
@@ -1172,6 +1226,8 @@
     <w:p>
       <w:pPr>
         <w:pStyle w:val="ListParagraph"/>
+        <w:keepNext w:val="false"/>
+        <w:keepLines/>
         <w:numPr>
           <w:ilvl w:val="0"/>
           <w:numId w:val="3"/>
@@ -1191,6 +1247,8 @@
     <w:p>
       <w:pPr>
         <w:pStyle w:val="ListParagraph"/>
+        <w:keepNext w:val="false"/>
+        <w:keepLines/>
         <w:numPr>
           <w:ilvl w:val="0"/>
           <w:numId w:val="3"/>
@@ -1210,6 +1268,8 @@
     <w:p>
       <w:pPr>
         <w:pStyle w:val="ListParagraph"/>
+        <w:keepNext w:val="false"/>
+        <w:keepLines/>
         <w:numPr>
           <w:ilvl w:val="0"/>
           <w:numId w:val="3"/>

</xml_diff>